<commit_message>
Add a complete React frontend and expand the academic document
- New frontend/ (React + Vite + Tailwind) consuming the api-gateway
  exclusively: landing page, auth, destination search with filters,
  personalized recommendations, full itinerary CRUD with a day-by-day
  timeline, and public itinerary sharing. Category-themed imagery with
  graceful fallback if a photo fails to load.
- Document: add a Frontend section, instructions to verify data is
  actually persisted in PostgreSQL (psql/Prisma Studio/pgAdmin), and
  extra Q&A covering each phase plus the frontend for the defense.
</commit_message>
<xml_diff>
--- a/docs/GLOBETROTTER_EXPLANATION.docx
+++ b/docs/GLOBETROTTER_EXPLANATION.docx
@@ -4274,6 +4274,1121 @@
         <w:t xml:space="preserve"> (pas seulement GlobeTrotter) seront supprimes.</w:t>
       </w:r>
     </w:p>
+    <w:p>
+      <w:r>
+        <w:br w:type="page"/>
+      </w:r>
+    </w:p>
+    <w:p>
+      <w:pPr>
+        <w:pStyle w:val="Heading1"/>
+      </w:pPr>
+      <w:r>
+        <w:t>29. Le Frontend - application web complete</w:t>
+      </w:r>
+    </w:p>
+    <w:p>
+      <w:r>
+        <w:t>En complement des 4 phases backend, une application web complete a ete developpee pour presenter le systeme de maniere concrete et impressionnante devant l'examinateur, plutot que de se limiter a Swagger/Postman.</w:t>
+      </w:r>
+    </w:p>
+    <w:p>
+      <w:pPr>
+        <w:pStyle w:val="Heading2"/>
+      </w:pPr>
+      <w:r>
+        <w:t>29.1 Stack technique</w:t>
+      </w:r>
+    </w:p>
+    <w:tbl>
+      <w:tblPr>
+        <w:tblStyle w:val="LightGrid-Accent1"/>
+        <w:tblW w:type="auto" w:w="0"/>
+        <w:jc w:val="center"/>
+        <w:tblLook w:firstColumn="1" w:firstRow="1" w:lastColumn="0" w:lastRow="0" w:noHBand="0" w:noVBand="1" w:val="04A0"/>
+      </w:tblPr>
+      <w:tblGrid>
+        <w:gridCol w:w="4873"/>
+        <w:gridCol w:w="4873"/>
+      </w:tblGrid>
+      <w:tr>
+        <w:tc>
+          <w:tcPr>
+            <w:tcW w:type="dxa" w:w="4873"/>
+            <w:shd w:fill="0B1F3A"/>
+          </w:tcPr>
+          <w:p>
+            <w:r/>
+            <w:r>
+              <w:rPr>
+                <w:b/>
+                <w:color w:val="FFFFFF"/>
+              </w:rPr>
+              <w:t>Technologie</w:t>
+            </w:r>
+          </w:p>
+        </w:tc>
+        <w:tc>
+          <w:tcPr>
+            <w:tcW w:type="dxa" w:w="4873"/>
+            <w:shd w:fill="0B1F3A"/>
+          </w:tcPr>
+          <w:p>
+            <w:r/>
+            <w:r>
+              <w:rPr>
+                <w:b/>
+                <w:color w:val="FFFFFF"/>
+              </w:rPr>
+              <w:t>Role</w:t>
+            </w:r>
+          </w:p>
+        </w:tc>
+      </w:tr>
+      <w:tr>
+        <w:tc>
+          <w:tcPr>
+            <w:tcW w:type="dxa" w:w="4873"/>
+          </w:tcPr>
+          <w:p>
+            <w:r/>
+            <w:r>
+              <w:t>React 18 + Vite</w:t>
+            </w:r>
+          </w:p>
+        </w:tc>
+        <w:tc>
+          <w:tcPr>
+            <w:tcW w:type="dxa" w:w="4873"/>
+          </w:tcPr>
+          <w:p>
+            <w:r/>
+            <w:r>
+              <w:t>Framework UI et outil de build rapide (hot-reload instantane)</w:t>
+            </w:r>
+          </w:p>
+        </w:tc>
+      </w:tr>
+      <w:tr>
+        <w:tc>
+          <w:tcPr>
+            <w:tcW w:type="dxa" w:w="4873"/>
+          </w:tcPr>
+          <w:p>
+            <w:r/>
+            <w:r>
+              <w:t>React Router</w:t>
+            </w:r>
+          </w:p>
+        </w:tc>
+        <w:tc>
+          <w:tcPr>
+            <w:tcW w:type="dxa" w:w="4873"/>
+          </w:tcPr>
+          <w:p>
+            <w:r/>
+            <w:r>
+              <w:t>Navigation cote client (SPA) : pages publiques et protegees</w:t>
+            </w:r>
+          </w:p>
+        </w:tc>
+      </w:tr>
+      <w:tr>
+        <w:tc>
+          <w:tcPr>
+            <w:tcW w:type="dxa" w:w="4873"/>
+          </w:tcPr>
+          <w:p>
+            <w:r/>
+            <w:r>
+              <w:t>Tailwind CSS</w:t>
+            </w:r>
+          </w:p>
+        </w:tc>
+        <w:tc>
+          <w:tcPr>
+            <w:tcW w:type="dxa" w:w="4873"/>
+          </w:tcPr>
+          <w:p>
+            <w:r/>
+            <w:r>
+              <w:t>Design system utilitaire : coherence visuelle, responsive, dark-ready</w:t>
+            </w:r>
+          </w:p>
+        </w:tc>
+      </w:tr>
+      <w:tr>
+        <w:tc>
+          <w:tcPr>
+            <w:tcW w:type="dxa" w:w="4873"/>
+          </w:tcPr>
+          <w:p>
+            <w:r/>
+            <w:r>
+              <w:t>Axios</w:t>
+            </w:r>
+          </w:p>
+        </w:tc>
+        <w:tc>
+          <w:tcPr>
+            <w:tcW w:type="dxa" w:w="4873"/>
+          </w:tcPr>
+          <w:p>
+            <w:r/>
+            <w:r>
+              <w:t>Client HTTP vers l’API, avec intercepteur qui attache automatiquement le token JWT</w:t>
+            </w:r>
+          </w:p>
+        </w:tc>
+      </w:tr>
+      <w:tr>
+        <w:tc>
+          <w:tcPr>
+            <w:tcW w:type="dxa" w:w="4873"/>
+          </w:tcPr>
+          <w:p>
+            <w:r/>
+            <w:r>
+              <w:t>lucide-react</w:t>
+            </w:r>
+          </w:p>
+        </w:tc>
+        <w:tc>
+          <w:tcPr>
+            <w:tcW w:type="dxa" w:w="4873"/>
+          </w:tcPr>
+          <w:p>
+            <w:r/>
+            <w:r>
+              <w:t>Icones vectorielles coherentes dans toute l’application</w:t>
+            </w:r>
+          </w:p>
+        </w:tc>
+      </w:tr>
+      <w:tr>
+        <w:tc>
+          <w:tcPr>
+            <w:tcW w:type="dxa" w:w="4873"/>
+          </w:tcPr>
+          <w:p>
+            <w:r/>
+            <w:r>
+              <w:t>react-hot-toast</w:t>
+            </w:r>
+          </w:p>
+        </w:tc>
+        <w:tc>
+          <w:tcPr>
+            <w:tcW w:type="dxa" w:w="4873"/>
+          </w:tcPr>
+          <w:p>
+            <w:r/>
+            <w:r>
+              <w:t>Notifications visuelles (succes/erreur) pour chaque action</w:t>
+            </w:r>
+          </w:p>
+        </w:tc>
+      </w:tr>
+    </w:tbl>
+    <w:p/>
+    <w:p>
+      <w:r>
+        <w:t xml:space="preserve">Le frontend parle exclusivement a </w:t>
+      </w:r>
+      <w:r>
+        <w:rPr>
+          <w:b/>
+        </w:rPr>
+        <w:t>l'api-gateway</w:t>
+      </w:r>
+      <w:r>
+        <w:t xml:space="preserve"> (jamais directement a un microservice), exactement comme le ferait n'importe quel client reel - c'est la preuve concrete que le gateway de la Phase 2 fonctionne comme un vrai point d'entree unique.</w:t>
+      </w:r>
+    </w:p>
+    <w:p>
+      <w:pPr>
+        <w:pStyle w:val="Heading2"/>
+      </w:pPr>
+      <w:r>
+        <w:t>29.2 Pages et fonctionnalites</w:t>
+      </w:r>
+    </w:p>
+    <w:tbl>
+      <w:tblPr>
+        <w:tblStyle w:val="LightGrid-Accent1"/>
+        <w:tblW w:type="auto" w:w="0"/>
+        <w:jc w:val="center"/>
+        <w:tblLook w:firstColumn="1" w:firstRow="1" w:lastColumn="0" w:lastRow="0" w:noHBand="0" w:noVBand="1" w:val="04A0"/>
+      </w:tblPr>
+      <w:tblGrid>
+        <w:gridCol w:w="3249"/>
+        <w:gridCol w:w="3249"/>
+        <w:gridCol w:w="3249"/>
+      </w:tblGrid>
+      <w:tr>
+        <w:tc>
+          <w:tcPr>
+            <w:tcW w:type="dxa" w:w="3249"/>
+            <w:shd w:fill="0B1F3A"/>
+          </w:tcPr>
+          <w:p>
+            <w:r/>
+            <w:r>
+              <w:rPr>
+                <w:b/>
+                <w:color w:val="FFFFFF"/>
+              </w:rPr>
+              <w:t>Page</w:t>
+            </w:r>
+          </w:p>
+        </w:tc>
+        <w:tc>
+          <w:tcPr>
+            <w:tcW w:type="dxa" w:w="3249"/>
+            <w:shd w:fill="0B1F3A"/>
+          </w:tcPr>
+          <w:p>
+            <w:r/>
+            <w:r>
+              <w:rPr>
+                <w:b/>
+                <w:color w:val="FFFFFF"/>
+              </w:rPr>
+              <w:t>Route</w:t>
+            </w:r>
+          </w:p>
+        </w:tc>
+        <w:tc>
+          <w:tcPr>
+            <w:tcW w:type="dxa" w:w="3249"/>
+            <w:shd w:fill="0B1F3A"/>
+          </w:tcPr>
+          <w:p>
+            <w:r/>
+            <w:r>
+              <w:rPr>
+                <w:b/>
+                <w:color w:val="FFFFFF"/>
+              </w:rPr>
+              <w:t>Fonctionnalite</w:t>
+            </w:r>
+          </w:p>
+        </w:tc>
+      </w:tr>
+      <w:tr>
+        <w:tc>
+          <w:tcPr>
+            <w:tcW w:type="dxa" w:w="3249"/>
+          </w:tcPr>
+          <w:p>
+            <w:r/>
+            <w:r>
+              <w:t>Accueil</w:t>
+            </w:r>
+          </w:p>
+        </w:tc>
+        <w:tc>
+          <w:tcPr>
+            <w:tcW w:type="dxa" w:w="3249"/>
+          </w:tcPr>
+          <w:p>
+            <w:r/>
+            <w:r>
+              <w:t>/</w:t>
+            </w:r>
+          </w:p>
+        </w:tc>
+        <w:tc>
+          <w:tcPr>
+            <w:tcW w:type="dxa" w:w="3249"/>
+          </w:tcPr>
+          <w:p>
+            <w:r/>
+            <w:r>
+              <w:t>Recherche rapide, mise en avant des categories, presentation des fonctionnalites</w:t>
+            </w:r>
+          </w:p>
+        </w:tc>
+      </w:tr>
+      <w:tr>
+        <w:tc>
+          <w:tcPr>
+            <w:tcW w:type="dxa" w:w="3249"/>
+          </w:tcPr>
+          <w:p>
+            <w:r/>
+            <w:r>
+              <w:t>Connexion / Inscription</w:t>
+            </w:r>
+          </w:p>
+        </w:tc>
+        <w:tc>
+          <w:tcPr>
+            <w:tcW w:type="dxa" w:w="3249"/>
+          </w:tcPr>
+          <w:p>
+            <w:r/>
+            <w:r>
+              <w:t>/login, /register</w:t>
+            </w:r>
+          </w:p>
+        </w:tc>
+        <w:tc>
+          <w:tcPr>
+            <w:tcW w:type="dxa" w:w="3249"/>
+          </w:tcPr>
+          <w:p>
+            <w:r/>
+            <w:r>
+              <w:t>Authentification JWT, preferences de voyage a l’inscription</w:t>
+            </w:r>
+          </w:p>
+        </w:tc>
+      </w:tr>
+      <w:tr>
+        <w:tc>
+          <w:tcPr>
+            <w:tcW w:type="dxa" w:w="3249"/>
+          </w:tcPr>
+          <w:p>
+            <w:r/>
+            <w:r>
+              <w:t>Destinations</w:t>
+            </w:r>
+          </w:p>
+        </w:tc>
+        <w:tc>
+          <w:tcPr>
+            <w:tcW w:type="dxa" w:w="3249"/>
+          </w:tcPr>
+          <w:p>
+            <w:r/>
+            <w:r>
+              <w:t>/destinations</w:t>
+            </w:r>
+          </w:p>
+        </w:tc>
+        <w:tc>
+          <w:tcPr>
+            <w:tcW w:type="dxa" w:w="3249"/>
+          </w:tcPr>
+          <w:p>
+            <w:r/>
+            <w:r>
+              <w:t>Recherche, filtres (categorie, budget), pagination, ajout a un itineraire</w:t>
+            </w:r>
+          </w:p>
+        </w:tc>
+      </w:tr>
+      <w:tr>
+        <w:tc>
+          <w:tcPr>
+            <w:tcW w:type="dxa" w:w="3249"/>
+          </w:tcPr>
+          <w:p>
+            <w:r/>
+            <w:r>
+              <w:t>Recommandations</w:t>
+            </w:r>
+          </w:p>
+        </w:tc>
+        <w:tc>
+          <w:tcPr>
+            <w:tcW w:type="dxa" w:w="3249"/>
+          </w:tcPr>
+          <w:p>
+            <w:r/>
+            <w:r>
+              <w:t>/recommendations</w:t>
+            </w:r>
+          </w:p>
+        </w:tc>
+        <w:tc>
+          <w:tcPr>
+            <w:tcW w:type="dxa" w:w="3249"/>
+          </w:tcPr>
+          <w:p>
+            <w:r/>
+            <w:r>
+              <w:t>Cartes avec score et raisons expliquees (page protegee)</w:t>
+            </w:r>
+          </w:p>
+        </w:tc>
+      </w:tr>
+      <w:tr>
+        <w:tc>
+          <w:tcPr>
+            <w:tcW w:type="dxa" w:w="3249"/>
+          </w:tcPr>
+          <w:p>
+            <w:r/>
+            <w:r>
+              <w:t>Mes itineraires</w:t>
+            </w:r>
+          </w:p>
+        </w:tc>
+        <w:tc>
+          <w:tcPr>
+            <w:tcW w:type="dxa" w:w="3249"/>
+          </w:tcPr>
+          <w:p>
+            <w:r/>
+            <w:r>
+              <w:t>/itineraries</w:t>
+            </w:r>
+          </w:p>
+        </w:tc>
+        <w:tc>
+          <w:tcPr>
+            <w:tcW w:type="dxa" w:w="3249"/>
+          </w:tcPr>
+          <w:p>
+            <w:r/>
+            <w:r>
+              <w:t>Liste, creation (page protegee)</w:t>
+            </w:r>
+          </w:p>
+        </w:tc>
+      </w:tr>
+      <w:tr>
+        <w:tc>
+          <w:tcPr>
+            <w:tcW w:type="dxa" w:w="3249"/>
+          </w:tcPr>
+          <w:p>
+            <w:r/>
+            <w:r>
+              <w:t>Detail itineraire</w:t>
+            </w:r>
+          </w:p>
+        </w:tc>
+        <w:tc>
+          <w:tcPr>
+            <w:tcW w:type="dxa" w:w="3249"/>
+          </w:tcPr>
+          <w:p>
+            <w:r/>
+            <w:r>
+              <w:t>/itineraries/:id</w:t>
+            </w:r>
+          </w:p>
+        </w:tc>
+        <w:tc>
+          <w:tcPr>
+            <w:tcW w:type="dxa" w:w="3249"/>
+          </w:tcPr>
+          <w:p>
+            <w:r/>
+            <w:r>
+              <w:t>Frise chronologique des etapes, ajout/suppression, changement de statut, partage (page protegee)</w:t>
+            </w:r>
+          </w:p>
+        </w:tc>
+      </w:tr>
+      <w:tr>
+        <w:tc>
+          <w:tcPr>
+            <w:tcW w:type="dxa" w:w="3249"/>
+          </w:tcPr>
+          <w:p>
+            <w:r/>
+            <w:r>
+              <w:t>Itineraire partage</w:t>
+            </w:r>
+          </w:p>
+        </w:tc>
+        <w:tc>
+          <w:tcPr>
+            <w:tcW w:type="dxa" w:w="3249"/>
+          </w:tcPr>
+          <w:p>
+            <w:r/>
+            <w:r>
+              <w:t>/shared/:token</w:t>
+            </w:r>
+          </w:p>
+        </w:tc>
+        <w:tc>
+          <w:tcPr>
+            <w:tcW w:type="dxa" w:w="3249"/>
+          </w:tcPr>
+          <w:p>
+            <w:r/>
+            <w:r>
+              <w:t>Vue publique en lecture seule, sans authentification</w:t>
+            </w:r>
+          </w:p>
+        </w:tc>
+      </w:tr>
+    </w:tbl>
+    <w:p/>
+    <w:p>
+      <w:pPr>
+        <w:pStyle w:val="Heading2"/>
+      </w:pPr>
+      <w:r>
+        <w:t>29.3 Points de design a souligner a l’oral</w:t>
+      </w:r>
+    </w:p>
+    <w:p>
+      <w:pPr>
+        <w:pStyle w:val="ListBullet"/>
+      </w:pPr>
+      <w:r>
+        <w:rPr>
+          <w:b/>
+        </w:rPr>
+        <w:t>Categorisation visuelle</w:t>
+      </w:r>
+      <w:r>
+        <w:t xml:space="preserve"> : chaque destination affiche une photo et une icone correspondant a sa categorie (plage, culture, nature, aventure, ville, luxe), avec repli automatique sur un degrade colore si l’image ne charge pas (robustesse hors-ligne).</w:t>
+      </w:r>
+    </w:p>
+    <w:p>
+      <w:pPr>
+        <w:pStyle w:val="ListBullet"/>
+      </w:pPr>
+      <w:r>
+        <w:rPr>
+          <w:b/>
+        </w:rPr>
+        <w:t>Score de recommandation visualise</w:t>
+      </w:r>
+      <w:r>
+        <w:t xml:space="preserve"> : barre de progression + badges expliquant chaque raison du score (transparence de l’algorithme, voir section 12).</w:t>
+      </w:r>
+    </w:p>
+    <w:p>
+      <w:pPr>
+        <w:pStyle w:val="ListBullet"/>
+      </w:pPr>
+      <w:r>
+        <w:rPr>
+          <w:b/>
+        </w:rPr>
+        <w:t>Protection des routes</w:t>
+      </w:r>
+      <w:r>
+        <w:t xml:space="preserve"> : </w:t>
+      </w:r>
+      <w:r>
+        <w:rPr>
+          <w:rFonts w:ascii="Consolas" w:hAnsi="Consolas"/>
+          <w:sz w:val="20"/>
+        </w:rPr>
+        <w:t>/recommendations</w:t>
+      </w:r>
+      <w:r>
+        <w:t xml:space="preserve">, </w:t>
+      </w:r>
+      <w:r>
+        <w:rPr>
+          <w:rFonts w:ascii="Consolas" w:hAnsi="Consolas"/>
+          <w:sz w:val="20"/>
+        </w:rPr>
+        <w:t>/itineraries</w:t>
+      </w:r>
+      <w:r>
+        <w:t xml:space="preserve"> redirigent vers </w:t>
+      </w:r>
+      <w:r>
+        <w:rPr>
+          <w:rFonts w:ascii="Consolas" w:hAnsi="Consolas"/>
+          <w:sz w:val="20"/>
+        </w:rPr>
+        <w:t>/login</w:t>
+      </w:r>
+      <w:r>
+        <w:t xml:space="preserve"> si non authentifie (composant </w:t>
+      </w:r>
+      <w:r>
+        <w:rPr>
+          <w:rFonts w:ascii="Consolas" w:hAnsi="Consolas"/>
+          <w:sz w:val="20"/>
+        </w:rPr>
+        <w:t>ProtectedRoute</w:t>
+      </w:r>
+      <w:r>
+        <w:t>), reproduisant cote client la protection deja appliquee cote API.</w:t>
+      </w:r>
+    </w:p>
+    <w:p>
+      <w:pPr>
+        <w:pStyle w:val="ListBullet"/>
+      </w:pPr>
+      <w:r>
+        <w:rPr>
+          <w:b/>
+        </w:rPr>
+        <w:t>Responsive</w:t>
+      </w:r>
+      <w:r>
+        <w:t xml:space="preserve"> : menu mobile, grilles qui s’adaptent (1 a 4 colonnes selon la largeur d’ecran).</w:t>
+      </w:r>
+    </w:p>
+    <w:p>
+      <w:pPr>
+        <w:pStyle w:val="Heading2"/>
+      </w:pPr>
+      <w:r>
+        <w:t>29.4 Lancer le frontend</w:t>
+      </w:r>
+    </w:p>
+    <w:p>
+      <w:pPr>
+        <w:spacing w:before="80" w:after="80"/>
+        <w:ind w:left="283"/>
+      </w:pPr>
+      <w:r>
+        <w:rPr>
+          <w:rFonts w:ascii="Consolas" w:hAnsi="Consolas"/>
+          <w:sz w:val="19"/>
+        </w:rPr>
+        <w:t>cd frontend</w:t>
+        <w:br/>
+        <w:t>npm install</w:t>
+        <w:br/>
+        <w:t>cp .env.example .env   # VITE_API_URL doit pointer vers l'api-gateway (ex: http://localhost:3000)</w:t>
+        <w:br/>
+        <w:t>npm run dev</w:t>
+        <w:br/>
+        <w:t># Application disponible sur http://localhost:5173</w:t>
+      </w:r>
+    </w:p>
+    <w:p>
+      <w:r>
+        <w:t>Le frontend necessite que l'api-gateway (et donc toute la stack backend) soit deja demarre - voir section 25.</w:t>
+      </w:r>
+    </w:p>
+    <w:p>
+      <w:pPr>
+        <w:pStyle w:val="Heading1"/>
+      </w:pPr>
+      <w:r>
+        <w:t>30. Comment montrer que les donnees sont bien enregistrees en base</w:t>
+      </w:r>
+    </w:p>
+    <w:p>
+      <w:r>
+        <w:t>Pour prouver a l'examinateur que les actions faites dans le frontend (ou via l'API) sont reellement persistees en PostgreSQL - et pas simulees en memoire - trois methodes, de la plus rapide a la plus visuelle :</w:t>
+      </w:r>
+    </w:p>
+    <w:p>
+      <w:pPr>
+        <w:pStyle w:val="Heading2"/>
+      </w:pPr>
+      <w:r>
+        <w:t>Option A - psql en ligne de commande (rapide, dans le conteneur)</w:t>
+      </w:r>
+    </w:p>
+    <w:p>
+      <w:r>
+        <w:t>Chaque microservice a sa propre base (voir section 8). Exemple pour verifier un utilisateur cree :</w:t>
+      </w:r>
+    </w:p>
+    <w:p>
+      <w:pPr>
+        <w:spacing w:before="80" w:after="80"/>
+        <w:ind w:left="283"/>
+      </w:pPr>
+      <w:r>
+        <w:rPr>
+          <w:rFonts w:ascii="Consolas" w:hAnsi="Consolas"/>
+          <w:sz w:val="19"/>
+        </w:rPr>
+        <w:t>docker exec -it globetrotter-postgres psql -U postgres -d globetrotter_users \</w:t>
+        <w:br/>
+        <w:t xml:space="preserve">  -c "SELECT id, first_name, last_name, email, created_at FROM users ORDER BY created_at DESC LIMIT 5;"</w:t>
+        <w:br/>
+        <w:br/>
+        <w:t>docker exec -it globetrotter-postgres psql -U postgres -d globetrotter_itineraries \</w:t>
+        <w:br/>
+        <w:t xml:space="preserve">  -c "SELECT id, title, status, created_at FROM itineraries ORDER BY created_at DESC LIMIT 5;"</w:t>
+        <w:br/>
+        <w:br/>
+        <w:t>docker exec -it globetrotter-postgres psql -U postgres -d globetrotter_destinations \</w:t>
+        <w:br/>
+        <w:t xml:space="preserve">  -c "SELECT count(*) FROM destinations;"</w:t>
+      </w:r>
+    </w:p>
+    <w:p>
+      <w:r>
+        <w:t xml:space="preserve">Deroule de demo convaincant : creer un compte ou un itineraire dans le frontend, puis executer immediatement la requete SQL correspondante et montrer la ligne fraichement inseree (le </w:t>
+      </w:r>
+      <w:r>
+        <w:rPr>
+          <w:rFonts w:ascii="Consolas" w:hAnsi="Consolas"/>
+          <w:sz w:val="20"/>
+        </w:rPr>
+        <w:t>created_at</w:t>
+      </w:r>
+      <w:r>
+        <w:t xml:space="preserve"> correspond a l'instant present).</w:t>
+      </w:r>
+    </w:p>
+    <w:p>
+      <w:pPr>
+        <w:pStyle w:val="Heading2"/>
+      </w:pPr>
+      <w:r>
+        <w:t>Option B - Prisma Studio (interface graphique, sans SQL)</w:t>
+      </w:r>
+    </w:p>
+    <w:p>
+      <w:pPr>
+        <w:spacing w:before="80" w:after="80"/>
+        <w:ind w:left="283"/>
+      </w:pPr>
+      <w:r>
+        <w:rPr>
+          <w:rFonts w:ascii="Consolas" w:hAnsi="Consolas"/>
+          <w:sz w:val="19"/>
+        </w:rPr>
+        <w:t>cd services/users-service   # ou destinations-service / itineraries-service</w:t>
+        <w:br/>
+        <w:t>npx prisma studio</w:t>
+        <w:br/>
+        <w:t># Ouvre automatiquement une interface web sur http://localhost:5555</w:t>
+        <w:br/>
+        <w:t># pour parcourir et filtrer les tables visuellement</w:t>
+      </w:r>
+    </w:p>
+    <w:p>
+      <w:pPr>
+        <w:pStyle w:val="Heading2"/>
+      </w:pPr>
+      <w:r>
+        <w:t>Option C - pgAdmin ou tout client PostgreSQL</w:t>
+      </w:r>
+    </w:p>
+    <w:p>
+      <w:r>
+        <w:t xml:space="preserve">Se connecter a </w:t>
+      </w:r>
+      <w:r>
+        <w:rPr>
+          <w:rFonts w:ascii="Consolas" w:hAnsi="Consolas"/>
+          <w:sz w:val="20"/>
+        </w:rPr>
+        <w:t>localhost:5432</w:t>
+      </w:r>
+      <w:r>
+        <w:t xml:space="preserve"> (utilisateur </w:t>
+      </w:r>
+      <w:r>
+        <w:rPr>
+          <w:rFonts w:ascii="Consolas" w:hAnsi="Consolas"/>
+          <w:sz w:val="20"/>
+        </w:rPr>
+        <w:t>postgres</w:t>
+      </w:r>
+      <w:r>
+        <w:t xml:space="preserve">, mot de passe defini dans </w:t>
+      </w:r>
+      <w:r>
+        <w:rPr>
+          <w:rFonts w:ascii="Consolas" w:hAnsi="Consolas"/>
+          <w:sz w:val="20"/>
+        </w:rPr>
+        <w:t>infra/docker-compose.yml</w:t>
+      </w:r>
+      <w:r>
+        <w:t xml:space="preserve"> ou </w:t>
+      </w:r>
+      <w:r>
+        <w:rPr>
+          <w:rFonts w:ascii="Consolas" w:hAnsi="Consolas"/>
+          <w:sz w:val="20"/>
+        </w:rPr>
+        <w:t>.env</w:t>
+      </w:r>
+      <w:r>
+        <w:t xml:space="preserve">), puis naviguer dans les bases </w:t>
+      </w:r>
+      <w:r>
+        <w:rPr>
+          <w:rFonts w:ascii="Consolas" w:hAnsi="Consolas"/>
+          <w:sz w:val="20"/>
+        </w:rPr>
+        <w:t>globetrotter_users</w:t>
+      </w:r>
+      <w:r>
+        <w:t xml:space="preserve">, </w:t>
+      </w:r>
+      <w:r>
+        <w:rPr>
+          <w:rFonts w:ascii="Consolas" w:hAnsi="Consolas"/>
+          <w:sz w:val="20"/>
+        </w:rPr>
+        <w:t>globetrotter_destinations</w:t>
+      </w:r>
+      <w:r>
+        <w:t xml:space="preserve">, </w:t>
+      </w:r>
+      <w:r>
+        <w:rPr>
+          <w:rFonts w:ascii="Consolas" w:hAnsi="Consolas"/>
+          <w:sz w:val="20"/>
+        </w:rPr>
+        <w:t>globetrotter_itineraries</w:t>
+      </w:r>
+      <w:r>
+        <w:t>.</w:t>
+      </w:r>
+    </w:p>
+    <w:p>
+      <w:pPr>
+        <w:pStyle w:val="Heading2"/>
+      </w:pPr>
+      <w:r>
+        <w:t>Ce qu’il faut expliquer sur le pourquoi</w:t>
+      </w:r>
+    </w:p>
+    <w:p>
+      <w:pPr>
+        <w:pStyle w:val="ListBullet"/>
+      </w:pPr>
+      <w:r>
+        <w:t xml:space="preserve">Le frontend et l’API ne stockent </w:t>
+      </w:r>
+      <w:r>
+        <w:rPr>
+          <w:b/>
+        </w:rPr>
+        <w:t>jamais</w:t>
+      </w:r>
+      <w:r>
+        <w:t xml:space="preserve"> de donnees en memoire cote serveur : chaque ecriture (</w:t>
+      </w:r>
+      <w:r>
+        <w:rPr>
+          <w:rFonts w:ascii="Consolas" w:hAnsi="Consolas"/>
+          <w:sz w:val="20"/>
+        </w:rPr>
+        <w:t>POST</w:t>
+      </w:r>
+      <w:r>
+        <w:t xml:space="preserve">, </w:t>
+      </w:r>
+      <w:r>
+        <w:rPr>
+          <w:rFonts w:ascii="Consolas" w:hAnsi="Consolas"/>
+          <w:sz w:val="20"/>
+        </w:rPr>
+        <w:t>PUT</w:t>
+      </w:r>
+      <w:r>
+        <w:t xml:space="preserve">, </w:t>
+      </w:r>
+      <w:r>
+        <w:rPr>
+          <w:rFonts w:ascii="Consolas" w:hAnsi="Consolas"/>
+          <w:sz w:val="20"/>
+        </w:rPr>
+        <w:t>DELETE</w:t>
+      </w:r>
+      <w:r>
+        <w:t>) passe par Prisma vers PostgreSQL avant de repondre au client.</w:t>
+      </w:r>
+    </w:p>
+    <w:p>
+      <w:pPr>
+        <w:pStyle w:val="ListBullet"/>
+      </w:pPr>
+      <w:r>
+        <w:t xml:space="preserve">C’est pour cela qu’un </w:t>
+      </w:r>
+      <w:r>
+        <w:rPr>
+          <w:rFonts w:ascii="Consolas" w:hAnsi="Consolas"/>
+          <w:sz w:val="20"/>
+        </w:rPr>
+        <w:t>docker compose down &amp;&amp; docker compose up</w:t>
+      </w:r>
+      <w:r>
+        <w:t xml:space="preserve"> conserve les donnees (grace au volume </w:t>
+      </w:r>
+      <w:r>
+        <w:rPr>
+          <w:rFonts w:ascii="Consolas" w:hAnsi="Consolas"/>
+          <w:sz w:val="20"/>
+        </w:rPr>
+        <w:t>postgres_data</w:t>
+      </w:r>
+      <w:r>
+        <w:t>), alors qu’un redemarrage d’un serveur qui «simulerait» les donnees en memoire les aurait perdues.</w:t>
+      </w:r>
+    </w:p>
+    <w:p>
+      <w:pPr>
+        <w:pStyle w:val="ListBullet"/>
+      </w:pPr>
+      <w:r>
+        <w:t xml:space="preserve">Chaque microservice a sa </w:t>
+      </w:r>
+      <w:r>
+        <w:rPr>
+          <w:b/>
+        </w:rPr>
+        <w:t>propre</w:t>
+      </w:r>
+      <w:r>
+        <w:t xml:space="preserve"> base (database-per-service, section 8) : c’est pourquoi il faut se connecter a 3 bases differentes pour voir l’ensemble des donnees, et pas une seule - c’est une consequence directe de la decomposition en microservices de la Phase 2.</w:t>
+      </w:r>
+    </w:p>
+    <w:p>
+      <w:pPr>
+        <w:pStyle w:val="Heading1"/>
+      </w:pPr>
+      <w:r>
+        <w:t>31. Questions/reponses complementaires (une par phase, y compris le frontend)</w:t>
+      </w:r>
+    </w:p>
+    <w:p>
+      <w:pPr>
+        <w:pStyle w:val="Heading2"/>
+      </w:pPr>
+      <w:r>
+        <w:t>Phase 1 - Monolithe</w:t>
+      </w:r>
+    </w:p>
+    <w:p>
+      <w:r>
+        <w:rPr>
+          <w:b/>
+        </w:rPr>
+        <w:t>Q : Pourquoi le monolithe est-il encore dans le depot si on a fait les microservices ?</w:t>
+      </w:r>
+    </w:p>
+    <w:p>
+      <w:r>
+        <w:t xml:space="preserve">R : Conserve volontairement dans </w:t>
+      </w:r>
+      <w:r>
+        <w:rPr>
+          <w:rFonts w:ascii="Consolas" w:hAnsi="Consolas"/>
+          <w:sz w:val="20"/>
+        </w:rPr>
+        <w:t>backend/</w:t>
+      </w:r>
+      <w:r>
+        <w:t xml:space="preserve"> comme reference pedagogique et point de comparaison direct - il montre concretement ce que la decomposition en Phase 2 a change dans le code.</w:t>
+      </w:r>
+    </w:p>
+    <w:p>
+      <w:pPr>
+        <w:pStyle w:val="Heading2"/>
+      </w:pPr>
+      <w:r>
+        <w:t>Phase 2 - Microservices</w:t>
+      </w:r>
+    </w:p>
+    <w:p>
+      <w:r>
+        <w:rPr>
+          <w:b/>
+        </w:rPr>
+        <w:t>Q : Que se passe-t-il si deux microservices ont besoin de la meme information (ex. le nom d’un utilisateur pour un itineraire) ?</w:t>
+      </w:r>
+    </w:p>
+    <w:p>
+      <w:r>
+        <w:t>R : Le service proprietaire de la donnee (</w:t>
+      </w:r>
+      <w:r>
+        <w:rPr>
+          <w:rFonts w:ascii="Consolas" w:hAnsi="Consolas"/>
+          <w:sz w:val="20"/>
+        </w:rPr>
+        <w:t>users-service</w:t>
+      </w:r>
+      <w:r>
+        <w:t xml:space="preserve">) reste la seule source de verite ; les autres services ne dupliquent pas la donnee en base, ils la redemandent via HTTP a chaque besoin (ex. </w:t>
+      </w:r>
+      <w:r>
+        <w:rPr>
+          <w:rFonts w:ascii="Consolas" w:hAnsi="Consolas"/>
+          <w:sz w:val="20"/>
+        </w:rPr>
+        <w:t>recommendations-service</w:t>
+      </w:r>
+      <w:r>
+        <w:t xml:space="preserve"> interroge </w:t>
+      </w:r>
+      <w:r>
+        <w:rPr>
+          <w:rFonts w:ascii="Consolas" w:hAnsi="Consolas"/>
+          <w:sz w:val="20"/>
+        </w:rPr>
+        <w:t>users-service</w:t>
+      </w:r>
+      <w:r>
+        <w:t xml:space="preserve"> a chaque calcul). C’est un choix de simplicite pour ce projet ; un systeme a tres grande echelle ajouterait du cache ou de la duplication controlee.</w:t>
+      </w:r>
+    </w:p>
+    <w:p>
+      <w:pPr>
+        <w:pStyle w:val="Heading2"/>
+      </w:pPr>
+      <w:r>
+        <w:t>Phase 3 - Cloud Deployment</w:t>
+      </w:r>
+    </w:p>
+    <w:p>
+      <w:r>
+        <w:rPr>
+          <w:b/>
+        </w:rPr>
+        <w:t>Q : Pourquoi une simulation locale (minikube) et pas un vrai cloud ?</w:t>
+      </w:r>
+    </w:p>
+    <w:p>
+      <w:r>
+        <w:t>R : Choix assume avec l’encadrant/utilisateur pour eviter un compte cloud payant tout en demontrant exactement les memes primitives (Deployment, Service, HorizontalPodAutoscaler) qu’un vrai cluster EKS/GKE/AKS - voir le tableau comparatif section 16.</w:t>
+      </w:r>
+    </w:p>
+    <w:p>
+      <w:pPr>
+        <w:pStyle w:val="Heading2"/>
+      </w:pPr>
+      <w:r>
+        <w:t>Phase 4 - Resilience</w:t>
+      </w:r>
+    </w:p>
+    <w:p>
+      <w:r>
+        <w:rPr>
+          <w:b/>
+        </w:rPr>
+        <w:t>Q : Le cache ne risque-t-il pas de montrer des donnees perimees a l’utilisateur ?</w:t>
+      </w:r>
+    </w:p>
+    <w:p>
+      <w:r>
+        <w:t>R : Oui, jusqu’a 30-60 secondes (TTL), c’est un compromis assume performance/fraicheur. Pour les recommandations, ce delai est reduit a l’instant meme ou une donnee pertinente change grace a l’invalidation par evenement RabbitMQ (section 19) : c’est precisement pour limiter ce risque que le cache ET la file de messages ont ete combines plutot que d’utiliser le cache seul.</w:t>
+      </w:r>
+    </w:p>
+    <w:p>
+      <w:pPr>
+        <w:pStyle w:val="Heading2"/>
+      </w:pPr>
+      <w:r>
+        <w:t>Frontend</w:t>
+      </w:r>
+    </w:p>
+    <w:p>
+      <w:r>
+        <w:rPr>
+          <w:b/>
+        </w:rPr>
+        <w:t>Q : Le frontend fait-il partie des exigences du cours ?</w:t>
+      </w:r>
+    </w:p>
+    <w:p>
+      <w:r>
+        <w:t>R : Non - explicitement hors perimetre des 4 phases (voir section 2 de la demonstration initiale) qui ne demandent qu’une API REST. Il a ete ajoute en supplement pour obtenir une application complete et demontrable visuellement, en consommant l’API exactement comme le ferait n’importe quel client tiers, sans aucun acces direct a la base de donnees.</w:t>
+      </w:r>
+    </w:p>
     <w:sectPr>
       <w:pgSz w:w="12240" w:h="15840"/>
       <w:pgMar w:top="1134" w:right="1247" w:bottom="1134" w:left="1247" w:header="720" w:footer="720" w:gutter="0"/>

</xml_diff>